<commit_message>
Update patent claims document with latest revisions
Update the document to include new claims and formatting changes for CIPC Submission 6.

Replit-Commit-Author: Agent
Replit-Commit-Session-Id: 0cbe7a84-a7a6-4a51-b09c-2be09cbda9ee
Replit-Commit-Checkpoint-Type: full_checkpoint
Replit-Commit-Event-Id: cffd41ad-6cd0-4710-82ec-3743addcb2e9
Replit-Commit-Screenshot-Url: https://storage.googleapis.com/screenshot-production-us-central1/1f99a8d9-3543-48bc-8564-b0463564e29d/0cbe7a84-a7a6-4a51-b09c-2be09cbda9ee/gFKu0U0
</commit_message>
<xml_diff>
--- a/docs/CuraLive_CIPC_CIP_Submission_6.docx
+++ b/docs/CuraLive_CIPC_CIP_Submission_6.docx
@@ -305,6 +305,7 @@
       <w:tr>
         <w:tc>
           <w:tcPr>
+            <w:tcW w:type="pct" w:w="40%"/>
             <w:tcBorders>
               <w:top w:val="none"/>
               <w:left w:val="none"/>
@@ -356,6 +357,7 @@
       <w:tr>
         <w:tc>
           <w:tcPr>
+            <w:tcW w:type="pct" w:w="40%"/>
             <w:tcBorders>
               <w:top w:val="none"/>
               <w:left w:val="none"/>
@@ -407,6 +409,7 @@
       <w:tr>
         <w:tc>
           <w:tcPr>
+            <w:tcW w:type="pct" w:w="40%"/>
             <w:tcBorders>
               <w:top w:val="none"/>
               <w:left w:val="none"/>
@@ -458,6 +461,7 @@
       <w:tr>
         <w:tc>
           <w:tcPr>
+            <w:tcW w:type="pct" w:w="40%"/>
             <w:tcBorders>
               <w:top w:val="none"/>
               <w:left w:val="none"/>
@@ -509,6 +513,7 @@
       <w:tr>
         <w:tc>
           <w:tcPr>
+            <w:tcW w:type="pct" w:w="40%"/>
             <w:tcBorders>
               <w:top w:val="none"/>
               <w:left w:val="none"/>
@@ -560,6 +565,7 @@
       <w:tr>
         <w:tc>
           <w:tcPr>
+            <w:tcW w:type="pct" w:w="40%"/>
             <w:tcBorders>
               <w:top w:val="none"/>
               <w:left w:val="none"/>
@@ -880,7 +886,7 @@
           <w:sz w:val="21"/>
           <w:szCs w:val="21"/>
         </w:rPr>
-        <w:t xml:space="preserve">13. New Claims (CIP Submission 6) — Claims 56–66</w:t>
+        <w:t xml:space="preserve">13. New Claims (CIP Submission 6) — Claims 56–70</w:t>
       </w:r>
     </w:p>
     <w:p>
@@ -1063,7 +1069,31 @@
           <w:sz w:val="21"/>
           <w:szCs w:val="21"/>
         </w:rPr>
-        <w:t xml:space="preserve">This submission adds 11 new claims (Claims 56–66), extending the patent to 66 total claims across 31 modules.</w:t>
+        <w:t xml:space="preserve">These innovations apply across Modules 28, 30, 31 and the platform's silent monitoring infrastructure.</w:t>
+      </w:r>
+    </w:p>
+    <w:p>
+      <w:pPr>
+        <w:spacing w:after="60"/>
+      </w:pPr>
+    </w:p>
+    <w:p>
+      <w:pPr>
+        <w:spacing w:after="120" w:before="0"/>
+        <w:jc w:val="left"/>
+      </w:pPr>
+      <w:r>
+        <w:rPr>
+          <w:rFonts w:ascii="Calibri" w:cs="Calibri" w:eastAsia="Calibri" w:hAnsi="Calibri"/>
+          <w:b w:val="false"/>
+          <w:bCs w:val="false"/>
+          <w:i w:val="false"/>
+          <w:iCs w:val="false"/>
+          <w:color w:val="000000"/>
+          <w:sz w:val="21"/>
+          <w:szCs w:val="21"/>
+        </w:rPr>
+        <w:t xml:space="preserve">This submission adds 15 new claims (Claims 56–70), extending the patent to 70 total claims across 31 modules.</w:t>
       </w:r>
     </w:p>
     <w:p>
@@ -1821,7 +1851,7 @@
                 <w:sz w:val="19"/>
                 <w:szCs w:val="19"/>
               </w:rPr>
-              <w:t xml:space="preserve">Claims 56–66, FIG 31–33</w:t>
+              <w:t xml:space="preserve">Claims 56–70, FIG 31–33</w:t>
             </w:r>
           </w:p>
         </w:tc>
@@ -2184,7 +2214,7 @@
           <w:sz w:val="21"/>
           <w:szCs w:val="21"/>
         </w:rPr>
-        <w:t xml:space="preserve">Extends the platform with 6 cross-cutting innovations spanning programmatic telephony, cross-platform orchestration, metadata-triggered authorization, governance gateways, sentiment-weighted triage, and network-latency compensation. These innovations apply across Modules 28, 31, and the platform's silent monitoring infrastructure. This submission adds 11 new claims (Claims 56–66), extending the patent to 66 total claims.</w:t>
+        <w:t xml:space="preserve">Extends the platform with 6 cross-cutting innovations spanning programmatic telephony, cross-platform orchestration, metadata-triggered authorization, governance gateways, sentiment-weighted triage, and network-latency compensation. These innovations apply across Modules 28, 30, 31, and the platform's silent monitoring infrastructure. This submission adds 15 new claims (Claims 56–70), extending the patent to 70 total claims.</w:t>
       </w:r>
     </w:p>
     <w:p>
@@ -2531,7 +2561,7 @@
           <w:sz w:val="21"/>
           <w:szCs w:val="21"/>
         </w:rPr>
-        <w:t xml:space="preserve">With this CIP Submission 6, the platform now comprises 31 interconnected subsystems with 66 claims. This filing introduces 6 cross-cutting innovations that enhance the platform's autonomous monitoring, Q&amp;A orchestration, and AI governance capabilities:</w:t>
+        <w:t xml:space="preserve">With this CIP Submission 6, the platform now comprises 31 interconnected subsystems with 70 claims. This filing introduces 6 cross-cutting innovations that enhance the platform's autonomous monitoring, Q&amp;A orchestration, and AI governance capabilities:</w:t>
       </w:r>
     </w:p>
     <w:p>
@@ -4011,7 +4041,7 @@
           <w:sz w:val="21"/>
           <w:szCs w:val="21"/>
         </w:rPr>
-        <w:t xml:space="preserve">Note: CIP Submission 6 introduces cross-cutting innovations (Claims 56–66) that enhance capabilities across Modules 28, 31, and the platform's silent monitoring infrastructure. No new module number is assigned as these innovations extend existing modules.</w:t>
+        <w:t xml:space="preserve">Note: CIP Submission 6 introduces cross-cutting innovations (Claims 56–70) that enhance capabilities across Modules 28, 30, 31, and the platform's silent monitoring infrastructure. No new module number is assigned as these innovations extend existing modules.</w:t>
       </w:r>
     </w:p>
     <w:p>
@@ -7155,7 +7185,7 @@
           <w:sz w:val="26"/>
           <w:szCs w:val="26"/>
         </w:rPr>
-        <w:t xml:space="preserve">13. New Claims (CIP Submission 6) — Claims 56–66</w:t>
+        <w:t xml:space="preserve">13. New Claims (CIP Submission 6) — Claims 56–70</w:t>
       </w:r>
     </w:p>
     <w:p>
@@ -7479,6 +7509,122 @@
     </w:p>
     <w:p>
       <w:pPr>
+        <w:spacing w:after="80" w:before="240"/>
+      </w:pPr>
+      <w:r>
+        <w:rPr>
+          <w:rFonts w:ascii="Calibri" w:cs="Calibri" w:eastAsia="Calibri" w:hAnsi="Calibri"/>
+          <w:b/>
+          <w:bCs/>
+          <w:color w:val="1B3A5C"/>
+          <w:sz w:val="22"/>
+          <w:szCs w:val="22"/>
+        </w:rPr>
+        <w:t xml:space="preserve">Claim 67 (Dependent on Claim 56)</w:t>
+      </w:r>
+    </w:p>
+    <w:p>
+      <w:pPr>
+        <w:spacing w:after="140"/>
+      </w:pPr>
+      <w:r>
+        <w:rPr>
+          <w:rFonts w:ascii="Calibri" w:cs="Calibri" w:eastAsia="Calibri" w:hAnsi="Calibri"/>
+          <w:sz w:val="21"/>
+          <w:szCs w:val="21"/>
+        </w:rPr>
+        <w:t xml:space="preserve">The method of Claim 56, wherein the DTMF handshake protocol includes a dual-carrier failover mechanism that automatically switches from a primary telephony carrier to a secondary carrier upon connection failure, ensuring uninterrupted bridge connectivity for persistent silent monitoring.</w:t>
+      </w:r>
+    </w:p>
+    <w:p>
+      <w:pPr>
+        <w:spacing w:after="80" w:before="240"/>
+      </w:pPr>
+      <w:r>
+        <w:rPr>
+          <w:rFonts w:ascii="Calibri" w:cs="Calibri" w:eastAsia="Calibri" w:hAnsi="Calibri"/>
+          <w:b/>
+          <w:bCs/>
+          <w:color w:val="1B3A5C"/>
+          <w:sz w:val="22"/>
+          <w:szCs w:val="22"/>
+        </w:rPr>
+        <w:t xml:space="preserve">Claim 68 (Dependent on Claim 62)</w:t>
+      </w:r>
+    </w:p>
+    <w:p>
+      <w:pPr>
+        <w:spacing w:after="140"/>
+      </w:pPr>
+      <w:r>
+        <w:rPr>
+          <w:rFonts w:ascii="Calibri" w:cs="Calibri" w:eastAsia="Calibri" w:hAnsi="Calibri"/>
+          <w:sz w:val="21"/>
+          <w:szCs w:val="21"/>
+        </w:rPr>
+        <w:t xml:space="preserve">The method of Claim 62, wherein the Go Live authorization gate is configurable per-session by the operator, allowing dynamic adjustment of the minimum triage score threshold and maximum compliance risk score based on the regulatory jurisdiction and event type.</w:t>
+      </w:r>
+    </w:p>
+    <w:p>
+      <w:pPr>
+        <w:spacing w:after="80" w:before="240"/>
+      </w:pPr>
+      <w:r>
+        <w:rPr>
+          <w:rFonts w:ascii="Calibri" w:cs="Calibri" w:eastAsia="Calibri" w:hAnsi="Calibri"/>
+          <w:b/>
+          <w:bCs/>
+          <w:color w:val="1B3A5C"/>
+          <w:sz w:val="22"/>
+          <w:szCs w:val="22"/>
+        </w:rPr>
+        <w:t xml:space="preserve">Claim 69 (Dependent on Claim 64)</w:t>
+      </w:r>
+    </w:p>
+    <w:p>
+      <w:pPr>
+        <w:spacing w:after="140"/>
+      </w:pPr>
+      <w:r>
+        <w:rPr>
+          <w:rFonts w:ascii="Calibri" w:cs="Calibri" w:eastAsia="Calibri" w:hAnsi="Calibri"/>
+          <w:sz w:val="21"/>
+          <w:szCs w:val="21"/>
+        </w:rPr>
+        <w:t xml:space="preserve">The governance gateway of Claim 64, wherein all governance decisions — including passed, blocked, and deferred tool promotions — are recorded in an immutable SHA-256 hash-chained audit log that provides a tamper-evident trail of autonomous AI deployment decisions for regulatory review.</w:t>
+      </w:r>
+    </w:p>
+    <w:p>
+      <w:pPr>
+        <w:spacing w:after="80" w:before="240"/>
+      </w:pPr>
+      <w:r>
+        <w:rPr>
+          <w:rFonts w:ascii="Calibri" w:cs="Calibri" w:eastAsia="Calibri" w:hAnsi="Calibri"/>
+          <w:b/>
+          <w:bCs/>
+          <w:color w:val="1B3A5C"/>
+          <w:sz w:val="22"/>
+          <w:szCs w:val="22"/>
+        </w:rPr>
+        <w:t xml:space="preserve">Claim 70 (Dependent on Claim 66)</w:t>
+      </w:r>
+    </w:p>
+    <w:p>
+      <w:pPr>
+        <w:spacing w:after="140"/>
+      </w:pPr>
+      <w:r>
+        <w:rPr>
+          <w:rFonts w:ascii="Calibri" w:cs="Calibri" w:eastAsia="Calibri" w:hAnsi="Calibri"/>
+          <w:sz w:val="21"/>
+          <w:szCs w:val="21"/>
+        </w:rPr>
+        <w:t xml:space="preserve">The synchronization method of Claim 66, wherein the system classifies real-time latency into categories (low ≤ 200ms, moderate ≤ 500ms, high ≤ 1500ms, critical &gt; 1500ms) and reports latency health status to the operator console, enabling proactive intervention when network conditions degrade below acceptable thresholds.</w:t>
+      </w:r>
+    </w:p>
+    <w:p>
+      <w:pPr>
         <w:pageBreakBefore/>
       </w:pPr>
       <w:r>
@@ -9444,6 +9590,25 @@
     </w:p>
     <w:p>
       <w:pPr>
+        <w:spacing w:after="120" w:before="0"/>
+        <w:jc w:val="left"/>
+      </w:pPr>
+      <w:r>
+        <w:rPr>
+          <w:rFonts w:ascii="Calibri" w:cs="Calibri" w:eastAsia="Calibri" w:hAnsi="Calibri"/>
+          <w:b w:val="false"/>
+          <w:bCs w:val="false"/>
+          <w:i/>
+          <w:iCs/>
+          <w:color w:val="666666"/>
+          <w:sz w:val="21"/>
+          <w:szCs w:val="21"/>
+        </w:rPr>
+        <w:t xml:space="preserve">FIG 31–33 are provided as black-and-white line drawings in accordance with CIPC drawing standards.</w:t>
+      </w:r>
+    </w:p>
+    <w:p>
+      <w:pPr>
         <w:pageBreakBefore/>
       </w:pPr>
       <w:r>
@@ -9616,7 +9781,7 @@
           <w:sz w:val="21"/>
           <w:szCs w:val="21"/>
         </w:rPr>
-        <w:t xml:space="preserve">All prior modules (1–31), claims (1–55), and figures (FIG 1–30) remain in full force. This submission adds Claims 56–66 and FIG 31–33.</w:t>
+        <w:t xml:space="preserve">All prior modules (1–31), claims (1–55), and figures (FIG 1–30) remain in full force. This submission adds Claims 56–70 and FIG 31–33.</w:t>
       </w:r>
     </w:p>
     <w:p>
@@ -9905,7 +10070,7 @@
           <w:sz w:val="18"/>
           <w:szCs w:val="18"/>
         </w:rPr>
-        <w:t xml:space="preserve">CIPC Patent Application ID 1773575338868 | 66 Total Claims | 31 Modules</w:t>
+        <w:t xml:space="preserve">CIPC Patent Application ID 1773575338868 | 70 Total Claims | 31 Modules</w:t>
       </w:r>
     </w:p>
     <w:sectPr>
@@ -10079,18 +10244,6 @@
       <w:lvlJc w:val="left"/>
       <w:pPr>
         <w:ind w:left="6480" w:hanging="360"/>
-      </w:pPr>
-    </w:lvl>
-  </w:abstractNum>
-  <w:abstractNum w:abstractNumId="2" w15:restartNumberingAfterBreak="0">
-    <w:multiLevelType w:val="hybridMultilevel"/>
-    <w:lvl w:ilvl="0" w15:tentative="1">
-      <w:start w:val="1"/>
-      <w:numFmt w:val="bullet"/>
-      <w:lvlText w:val="●"/>
-      <w:lvlJc w:val="left"/>
-      <w:pPr>
-        <w:ind w:left="720" w:hanging="360"/>
       </w:pPr>
     </w:lvl>
   </w:abstractNum>

</xml_diff>